<commit_message>
Fecho de síntese no §3 da Carta v7: soma das camadas da Justificativa
O §3 empilhava demanda corrente, lacuna de oferta, obras, setor privado e
upside sem parágrafo conclusivo — terminava direto na SUDENE. Novo parágrafo
entre Urussuquara e SUDENE soma: 345-450 mil t/ano na janela de obras
(275-350 correntes + 70-100 extraordinárias) vs ~5 mil t/ano de oferta
instalada; platô de 216 mil t = 62-79% só da demanda corrente (regime não
depende das obras); obras coincidem com carência + ramp (anos 1-3, 63-180
mil t/ano). Nenhum número novo — tudo já estabelecido no pacote.

Co-Authored-By: Claude Fable 5 <noreply@anthropic.com>
Claude-Session: https://claude.ai/code/session_01DqEaERD1LDFtugtNrL73cp
</commit_message>
<xml_diff>
--- a/Carta_Consulta_CIPREM_7.docx
+++ b/Carta_Consulta_CIPREM_7.docx
@@ -1007,6 +1007,15 @@
           <w:highlight w:val="yellow"/>
         </w:rPr>
         <w:t/>
+      </w:r>
+    </w:p>
+    <w:p>
+      <w:pPr>
+        <w:spacing w:after="160"/>
+        <w:jc w:val="both"/>
+      </w:pPr>
+      <w:r>
+        <w:t>Em síntese, as camadas somadas configuram, durante a janela de obras, uma demanda da ordem de 345 a 450 mil t/ano de brita no núcleo de quatro municípios (275–350 mil t/ano correntes + 70–100 mil t/ano extraordinárias), atendida hoje por uma única operação local de ~5 mil t/ano — todo o restante importado de 60 a 140 km, com frete embutido no preço. Frente a esse mercado, o platô do projeto (216 mil t/ano, 82% do teto licenciado) equivale a 62–79% apenas da demanda corrente — a receita de regime não depende do ciclo extraordinário de obras. Às obras cabe outro papel: coincidem com a carência e o ramp-up (anos 1–3, vendas de 63 a 180 mil t/ano), absorvendo a produção inicial justamente no período de maturação comercial. Mercado estruturalmente deficitário, vantagem logística e cronologia favorável compõem um quadro de baixo risco de demanda para o financiamento pleiteado.</w:t>
       </w:r>
     </w:p>
     <w:p>

</xml_diff>

<commit_message>
Mercado-base conservador SM+Conceição da Barra (235–275 mil t/ano) na Carta v7, Estudo v4 e plano de produção
Co-Authored-By: Claude Fable 5 <noreply@anthropic.com>
Claude-Session: https://claude.ai/code/session_01DqEaERD1LDFtugtNrL73cp
</commit_message>
<xml_diff>
--- a/Carta_Consulta_CIPREM_7.docx
+++ b/Carta_Consulta_CIPREM_7.docx
@@ -824,7 +824,7 @@
         <w:rPr>
           <w:color w:val="C00000"/>
         </w:rPr>
-        <w:t>São Mateus é o município mais populoso do norte do Espírito Santo (134,4 mil habitantes — IBGE, estimativa 2025; 8º do Estado) e polo regional de comércio e serviços. O mercado-base do empreendimento — definido pelo raio econômico do frete e pela posição real dos concorrentes, conforme o Estudo de Mercado anexo — é o núcleo de quatro municípios onde a jazida tem vantagem logística clara: São Mateus, Jaguaré, Boa Esperança e Conceição da Barra, que somam ~208 mil habitantes (IBGE, estimativas 2025 e Censo 2022). A demanda corrente de brita nesse núcleo é estimada entre 275 e 350 mil t/ano: na sede (215–230 mil t/ano), pelo consumo efetivo de brita no Espírito Santo apurado nas vendas declaradas à ANM (RAL), de 1,6–1,7 t/hab/ano em 2024–2025, convergente com o parâmetro setorial da ANEPAC; nos demais municípios, aplicada, por conservadorismo, metade do índice estadual, dado o perfil rural. Há ainda potencial secundário, não incluído nas projeções: Pedro Canário e a franja norte do Estado (Montanha, Mucurici e Ponto Belo), ~53 mil habitantes sem nenhum produtor de brita instalado, e — em atuação apenas oportunística — as praças de Nova Venécia e Pinheiros, sedes de concorrentes estabelecidos.</w:t>
+        <w:t>São Mateus é o município mais populoso do norte do Espírito Santo (134,4 mil habitantes — IBGE, estimativa 2025; 8º do Estado) e polo regional de comércio e serviços. O mercado-base do empreendimento — definido pelo raio econômico do frete e pela posição real dos concorrentes, conforme o Estudo de Mercado anexo — é deliberadamente conservador: restringe-se a São Mateus e Conceição da Barra (~162 mil habitantes — IBGE, estimativa 2025 e Censo 2022), municípios onde não há nenhum produtor de brita instalado. A demanda corrente nesse mercado-base é estimada entre 235 e 275 mil t/ano: na sede (215–230 mil t/ano), pelo consumo efetivo de brita no Espírito Santo apurado nas vendas declaradas à ANM (RAL), de 1,6–1,7 t/hab/ano em 2024–2025, convergente com o parâmetro setorial da ANEPAC; em Conceição da Barra, aplicada, por conservadorismo, metade do índice estadual. As praças vizinhas de Jaguaré e Boa Esperança (~46 mil habitantes; 36–78 mil t/ano) foram mantidas fora da linha de base — a primeira por ter um pequeno produtor instalado, a segunda por gravitar comercialmente para Nova Venécia — e permanecem, com Pedro Canário e a franja norte do Estado (Montanha, Mucurici e Ponto Belo, ~53 mil habitantes sem nenhum produtor de brita instalado), como potencial adicional de captura, não contado nas projeções.</w:t>
       </w:r>
       <w:proofErr w:type="spellStart"/>
       <w:r>
@@ -848,7 +848,7 @@
         <w:rPr>
           <w:color w:val="C00000"/>
         </w:rPr>
-        <w:t>A oferta instalada confirma a lacuna: não há extração de brita ativa em São Mateus — a presença concorrente na cidade limita-se a um pátio de beneficiamento e distribuição de pedreira sediada em Pinheiros (~70 km) — e, dentro do núcleo, o único produtor é uma operação de pequena escala em Jaguaré (~40 km da sede), com vendas da ordem de 5 mil t em 2025 pela base de arrecadação da CFEM (ANM, granito/ES). Os produtores de porte operam longe: o maior da região a ~73 km (unidade em Rio Bananal, ~360 mil t/ano) e os demais a 60–70 km (Nova Venécia e Pinheiros), com parte do suprimento vindo do eixo Linhares–Aracruz (85–140 km). A jazida da CIPREM está a ~35 km da sede — e a ~25 km de Boa Esperança: em um produto cujo preço posto na obra é dominado pelo frete, é vantagem competitiva estrutural no maior polo de demanda da região — a operação substitui suprimento de longa distância por produção local.</w:t>
+        <w:t>A oferta instalada confirma a lacuna: não há nenhum produtor de brita no mercado-base — em São Mateus, a presença concorrente limita-se a um pátio de beneficiamento e distribuição de pedreira sediada em Pinheiros (~70 km), e a operação mais próxima, de pequena escala (~5 mil t em 2025 pela base de arrecadação da CFEM — ANM, granito/ES), fica em Jaguaré (~40 km da sede), fora do mercado-base. Os produtores de porte operam longe: o maior da região a ~73 km (unidade em Rio Bananal, ~360 mil t/ano) e os demais a 60–70 km (Nova Venécia e Pinheiros), com parte do suprimento vindo do eixo Linhares–Aracruz (85–140 km). A jazida da CIPREM está a ~35 km da sede — e a ~25 km de Boa Esperança: em um produto cujo preço posto na obra é dominado pelo frete, é vantagem competitiva estrutural no maior polo de demanda da região — a operação substitui suprimento de longa distância por produção local.</w:t>
       </w:r>
     </w:p>
     <w:p>
@@ -1015,7 +1015,7 @@
         <w:jc w:val="both"/>
       </w:pPr>
       <w:r>
-        <w:t>Em síntese, as camadas somadas configuram, durante a janela de obras, uma demanda da ordem de 345 a 450 mil t/ano de brita no núcleo de quatro municípios (275–350 mil t/ano correntes + 70–100 mil t/ano extraordinárias), atendida hoje por uma única operação local de ~5 mil t/ano — todo o restante importado de 60 a 140 km, com frete embutido no preço. Frente a esse mercado, o platô do projeto (216 mil t/ano, 82% do teto licenciado) equivale a 62–79% apenas da demanda corrente — a receita de regime não depende do ciclo extraordinário de obras. Às obras cabe outro papel: coincidem com a carência e o ramp-up (anos 1–3, vendas de 63 a 180 mil t/ano), absorvendo a produção inicial justamente no período de maturação comercial. Mercado estruturalmente deficitário, vantagem logística e cronologia favorável compõem um quadro de baixo risco de demanda para o financiamento pleiteado.</w:t>
+        <w:t>Em síntese, mesmo sob a definição mais conservadora de mercado — linha de base restrita a São Mateus e Conceição da Barra, com as praças disputadas de Jaguaré e Boa Esperança deixadas de fora —, a demanda corrente, de 235 a 275 mil t/ano, já supera o platô do projeto (216 mil t/ano, 82% do teto licenciado): a receita de regime cabe integralmente no mercado-base, sem depender das obras nem das praças excluídas. Sobre essa base somam-se, como espaço de captura não contado nas projeções, a demanda extraordinária das obras (70–100 mil t/ano na janela, coincidente com a carência e o ramp-up dos anos 1–3, de 63 a 180 mil t/ano de vendas) e as praças mantidas fora da linha de base (36–78 mil t/ano). Um mercado estruturalmente deficitário — sem nenhum produtor instalado na base, com o grosso do suprimento viajando 60 a 140 km — completa um quadro de baixo risco de demanda para o financiamento pleiteado.</w:t>
       </w:r>
     </w:p>
     <w:p>

</xml_diff>